<commit_message>
fix: make maintenance.json an API route; tolerate missing redisLimiter; add /api/health
</commit_message>
<xml_diff>
--- a/Credentials.docx
+++ b/Credentials.docx
@@ -67,35 +67,19 @@
         </w:rPr>
         <w:t xml:space="preserve"> (super admin)</w:t>
       </w:r>
-    </w:p>
-    <w:p>
-      <w:pPr>
-        <w:rPr>
-          <w:rFonts w:ascii="Calibri" w:hAnsi="Calibri" w:cs="Calibri"/>
-        </w:rPr>
-      </w:pPr>
+      <w:r>
+        <w:rPr>
+          <w:rFonts w:ascii="Calibri" w:hAnsi="Calibri" w:cs="Calibri"/>
+        </w:rPr>
+        <w:t xml:space="preserve"> </w:t>
+      </w:r>
+      <w:r>
+        <w:rPr>
+          <w:rFonts w:ascii="Calibri" w:hAnsi="Calibri" w:cs="Calibri"/>
+        </w:rPr>
+        <w:br/>
+      </w:r>
       <w:hyperlink r:id="rId6" w:history="1">
-        <w:r>
-          <w:rPr>
-            <w:rStyle w:val="Hyperlink"/>
-            <w:rFonts w:ascii="Calibri" w:hAnsi="Calibri" w:cs="Calibri"/>
-          </w:rPr>
-          <w:t>wraja1987@gmail.com</w:t>
-        </w:r>
-      </w:hyperlink>
-      <w:r>
-        <w:rPr>
-          <w:rFonts w:ascii="Calibri" w:hAnsi="Calibri" w:cs="Calibri"/>
-        </w:rPr>
-        <w:t xml:space="preserve"> (admin)</w:t>
-      </w:r>
-      <w:r>
-        <w:rPr>
-          <w:rFonts w:ascii="Calibri" w:hAnsi="Calibri" w:cs="Calibri"/>
-        </w:rPr>
-        <w:br/>
-      </w:r>
-      <w:hyperlink r:id="rId7" w:history="1">
         <w:r>
           <w:rPr>
             <w:rStyle w:val="Hyperlink"/>
@@ -108,7 +92,19 @@
         <w:rPr>
           <w:rFonts w:ascii="Calibri" w:hAnsi="Calibri" w:cs="Calibri"/>
         </w:rPr>
-        <w:t xml:space="preserve"> (dummy / testing)</w:t>
+        <w:t xml:space="preserve"> </w:t>
+      </w:r>
+      <w:r>
+        <w:rPr>
+          <w:rFonts w:ascii="Calibri" w:hAnsi="Calibri" w:cs="Calibri"/>
+        </w:rPr>
+        <w:t>admin</w:t>
+      </w:r>
+      <w:r>
+        <w:rPr>
+          <w:rFonts w:ascii="Calibri" w:hAnsi="Calibri" w:cs="Calibri"/>
+        </w:rPr>
+        <w:t>(dummy / testing)</w:t>
       </w:r>
       <w:r>
         <w:rPr>
@@ -145,16 +141,7 @@
           <w:b/>
           <w:bCs/>
         </w:rPr>
-        <w:t>B</w:t>
-      </w:r>
-      <w:r>
-        <w:rPr>
-          <w:rStyle w:val="s1"/>
-          <w:rFonts w:ascii="Calibri" w:eastAsiaTheme="majorEastAsia" w:hAnsi="Calibri" w:cs="Calibri"/>
-          <w:b/>
-          <w:bCs/>
-        </w:rPr>
-        <w:t>ootstrap script</w:t>
+        <w:t>Bootstrap script</w:t>
       </w:r>
       <w:r>
         <w:rPr>

</xml_diff>